<commit_message>
Updated PLC and Batch file to create video with passing file paths. Now working.
</commit_message>
<xml_diff>
--- a/VideoPlaybackSupportFiles/OpenTopics.docx
+++ b/VideoPlaybackSupportFiles/OpenTopics.docx
@@ -42,6 +42,9 @@
           <w:numId w:val="1"/>
         </w:numPr>
       </w:pPr>
+      <w:r>
+        <w:t xml:space="preserve">Need a way to hide batch file. </w:t>
+      </w:r>
     </w:p>
     <w:p>
       <w:pPr>
@@ -220,33 +223,6 @@
           <w:numId w:val="1"/>
         </w:numPr>
       </w:pPr>
-      <w:r>
-        <w:t xml:space="preserve">Input code to trigger the event. </w:t>
-      </w:r>
-    </w:p>
-    <w:p>
-      <w:pPr>
-        <w:pStyle w:val="ListParagraph"/>
-        <w:numPr>
-          <w:ilvl w:val="0"/>
-          <w:numId w:val="1"/>
-        </w:numPr>
-      </w:pPr>
-      <w:r>
-        <w:t xml:space="preserve">When event is triggered, wait 15 seconds before calling the batch file. </w:t>
-      </w:r>
-    </w:p>
-    <w:p>
-      <w:pPr>
-        <w:pStyle w:val="ListParagraph"/>
-        <w:numPr>
-          <w:ilvl w:val="1"/>
-          <w:numId w:val="1"/>
-        </w:numPr>
-      </w:pPr>
-      <w:r>
-        <w:t>Add code to call batch file to create video with timestamp as argument.</w:t>
-      </w:r>
     </w:p>
     <w:p>
       <w:pPr>

</xml_diff>

<commit_message>
Updated batch with TODO notes
</commit_message>
<xml_diff>
--- a/VideoPlaybackSupportFiles/OpenTopics.docx
+++ b/VideoPlaybackSupportFiles/OpenTopics.docx
@@ -223,6 +223,21 @@
           <w:numId w:val="1"/>
         </w:numPr>
       </w:pPr>
+      <w:r>
+        <w:t xml:space="preserve">Add check that if video was created successfully then delete exported Scope images. </w:t>
+      </w:r>
+    </w:p>
+    <w:p>
+      <w:pPr>
+        <w:pStyle w:val="ListParagraph"/>
+        <w:numPr>
+          <w:ilvl w:val="0"/>
+          <w:numId w:val="1"/>
+        </w:numPr>
+      </w:pPr>
+      <w:r>
+        <w:t xml:space="preserve">Double check all seems to be working from trigger event through deleting the images. </w:t>
+      </w:r>
     </w:p>
     <w:p>
       <w:pPr>

</xml_diff>

<commit_message>
Updated Batch file to delete folder and other updates
</commit_message>
<xml_diff>
--- a/VideoPlaybackSupportFiles/OpenTopics.docx
+++ b/VideoPlaybackSupportFiles/OpenTopics.docx
@@ -28,10 +28,13 @@
         </w:numPr>
       </w:pPr>
       <w:r>
-        <w:t>Option to rename output files (export image files?)</w:t>
-      </w:r>
-      <w:r>
-        <w:t xml:space="preserve"> – Still needed?</w:t>
+        <w:t>If delete previous scope exports, can scope check the folder and start again with “export 1”</w:t>
+      </w:r>
+    </w:p>
+    <w:p/>
+    <w:p>
+      <w:r>
+        <w:t>Optional – nice to have</w:t>
       </w:r>
     </w:p>
     <w:p>
@@ -96,78 +99,135 @@
           <w:ilvl w:val="0"/>
           <w:numId w:val="1"/>
         </w:numPr>
-      </w:pPr>
-      <w:r>
         <w:rPr>
           <w:noProof/>
         </w:rPr>
-        <w:t>Investiage how to</w:t>
-      </w:r>
+      </w:pPr>
       <w:r>
         <w:rPr>
           <w:noProof/>
         </w:rPr>
-        <w:t>:</w:t>
+        <w:t>Add buttons to confirm and clear active alarm</w:t>
       </w:r>
     </w:p>
     <w:p>
       <w:pPr>
         <w:pStyle w:val="ListParagraph"/>
         <w:numPr>
-          <w:ilvl w:val="1"/>
+          <w:ilvl w:val="0"/>
           <w:numId w:val="1"/>
         </w:numPr>
-      </w:pPr>
-      <w:r>
         <w:rPr>
           <w:noProof/>
         </w:rPr>
-        <w:t xml:space="preserve">Pull timestamp from event selected in eventgrid. </w:t>
+      </w:pPr>
+      <w:r>
+        <w:rPr>
+          <w:noProof/>
+        </w:rPr>
+        <w:t>Add button to Trigger Alarm</w:t>
+      </w:r>
+    </w:p>
+    <w:p/>
+    <w:p>
+      <w:pPr>
+        <w:ind w:left="720"/>
+      </w:pPr>
+      <w:r>
+        <w:t>PLC</w:t>
+      </w:r>
+      <w:r>
+        <w:t xml:space="preserve">  </w:t>
+      </w:r>
+      <w:r>
+        <w:rPr>
+          <w:highlight w:val="green"/>
+        </w:rPr>
+        <w:t>-- Alyssa</w:t>
       </w:r>
     </w:p>
     <w:p>
       <w:pPr>
         <w:pStyle w:val="ListParagraph"/>
         <w:numPr>
-          <w:ilvl w:val="1"/>
+          <w:ilvl w:val="0"/>
           <w:numId w:val="1"/>
         </w:numPr>
       </w:pPr>
       <w:r>
-        <w:rPr>
-          <w:noProof/>
-        </w:rPr>
-        <w:t xml:space="preserve">Use that timestamp to call video with name as timestamp into content with video player. </w:t>
+        <w:t xml:space="preserve">Add check that if video was created successfully then delete exported Scope images. </w:t>
       </w:r>
     </w:p>
     <w:p>
       <w:pPr>
         <w:pStyle w:val="ListParagraph"/>
         <w:numPr>
-          <w:ilvl w:val="1"/>
+          <w:ilvl w:val="0"/>
           <w:numId w:val="1"/>
         </w:numPr>
       </w:pPr>
       <w:r>
-        <w:rPr>
-          <w:noProof/>
-        </w:rPr>
-        <w:t xml:space="preserve">Need virtual directories? </w:t>
+        <w:t xml:space="preserve">Double check all seems to be working from trigger event through deleting the images. </w:t>
+      </w:r>
+    </w:p>
+    <w:p>
+      <w:pPr>
+        <w:pStyle w:val="ListParagraph"/>
+        <w:ind w:left="1440"/>
+      </w:pPr>
+    </w:p>
+    <w:p>
+      <w:r>
+        <w:t>Video Playback</w:t>
+      </w:r>
+      <w:r>
+        <w:t xml:space="preserve"> </w:t>
+      </w:r>
+      <w:r>
+        <w:rPr>
+          <w:highlight w:val="green"/>
+        </w:rPr>
+        <w:t>--Alyssa</w:t>
       </w:r>
     </w:p>
     <w:p>
       <w:pPr>
         <w:pStyle w:val="ListParagraph"/>
         <w:numPr>
-          <w:ilvl w:val="1"/>
+          <w:ilvl w:val="0"/>
           <w:numId w:val="1"/>
         </w:numPr>
       </w:pPr>
       <w:r>
-        <w:rPr>
-          <w:noProof/>
-        </w:rPr>
-        <w:t xml:space="preserve">Ideally would be done without OBS </w:t>
+        <w:t xml:space="preserve">Video seems to be only 10-12 seconds long, should be 10 frames per second and about 30 seconds long… </w:t>
+      </w:r>
+    </w:p>
+    <w:p/>
+    <w:p/>
+    <w:p>
+      <w:r>
+        <w:rPr>
+          <w:highlight w:val="cyan"/>
+        </w:rPr>
+        <w:t>** ALL</w:t>
+      </w:r>
+      <w:r>
+        <w:t xml:space="preserve"> </w:t>
+      </w:r>
+    </w:p>
+    <w:p>
+      <w:pPr>
+        <w:pStyle w:val="ListParagraph"/>
+        <w:numPr>
+          <w:ilvl w:val="0"/>
+          <w:numId w:val="1"/>
+        </w:numPr>
+      </w:pPr>
+      <w:r>
+        <w:t xml:space="preserve">Need to document setup, file paths, etc. </w:t>
+      </w:r>
+      <w:r>
+        <w:t xml:space="preserve"> --- If you want to add, GO FOR IT </w:t>
       </w:r>
       <w:r>
         <w:rPr>
@@ -177,7 +237,6 @@
               <w:rFonts w:ascii="Segoe UI Emoji" w:eastAsia="Segoe UI Emoji" w:hAnsi="Segoe UI Emoji" w:cs="Segoe UI Emoji"/>
             </mc:Fallback>
           </mc:AlternateContent>
-          <w:noProof/>
         </w:rPr>
         <mc:AlternateContent>
           <mc:Choice Requires="w16se">
@@ -187,88 +246,6 @@
             <w:t>😊</w:t>
           </mc:Fallback>
         </mc:AlternateContent>
-      </w:r>
-    </w:p>
-    <w:p/>
-    <w:p>
-      <w:pPr>
-        <w:ind w:left="720"/>
-      </w:pPr>
-      <w:proofErr w:type="gramStart"/>
-      <w:r>
-        <w:t>PLC</w:t>
-      </w:r>
-      <w:r>
-        <w:t xml:space="preserve">  </w:t>
-      </w:r>
-      <w:r>
-        <w:rPr>
-          <w:highlight w:val="green"/>
-        </w:rPr>
-        <w:t>--</w:t>
-      </w:r>
-      <w:proofErr w:type="gramEnd"/>
-      <w:r>
-        <w:rPr>
-          <w:highlight w:val="green"/>
-        </w:rPr>
-        <w:t xml:space="preserve"> Alyssa</w:t>
-      </w:r>
-    </w:p>
-    <w:p>
-      <w:pPr>
-        <w:pStyle w:val="ListParagraph"/>
-        <w:numPr>
-          <w:ilvl w:val="0"/>
-          <w:numId w:val="1"/>
-        </w:numPr>
-      </w:pPr>
-      <w:r>
-        <w:t xml:space="preserve">Add check that if video was created successfully then delete exported Scope images. </w:t>
-      </w:r>
-    </w:p>
-    <w:p>
-      <w:pPr>
-        <w:pStyle w:val="ListParagraph"/>
-        <w:numPr>
-          <w:ilvl w:val="0"/>
-          <w:numId w:val="1"/>
-        </w:numPr>
-      </w:pPr>
-      <w:r>
-        <w:t xml:space="preserve">Double check all seems to be working from trigger event through deleting the images. </w:t>
-      </w:r>
-    </w:p>
-    <w:p>
-      <w:pPr>
-        <w:pStyle w:val="ListParagraph"/>
-        <w:ind w:left="1440"/>
-      </w:pPr>
-    </w:p>
-    <w:p>
-      <w:r>
-        <w:t>Video Playback</w:t>
-      </w:r>
-      <w:r>
-        <w:t xml:space="preserve"> </w:t>
-      </w:r>
-      <w:r>
-        <w:rPr>
-          <w:highlight w:val="green"/>
-        </w:rPr>
-        <w:t>--Alyssa</w:t>
-      </w:r>
-    </w:p>
-    <w:p>
-      <w:pPr>
-        <w:pStyle w:val="ListParagraph"/>
-        <w:numPr>
-          <w:ilvl w:val="0"/>
-          <w:numId w:val="1"/>
-        </w:numPr>
-      </w:pPr>
-      <w:r>
-        <w:t xml:space="preserve">Video seems to be only 10-12 seconds long, should be 10 frames per second and about 30 seconds long… </w:t>
       </w:r>
     </w:p>
     <w:sectPr>

</xml_diff>

<commit_message>
Updated README and Open Topics
</commit_message>
<xml_diff>
--- a/VideoPlaybackSupportFiles/OpenTopics.docx
+++ b/VideoPlaybackSupportFiles/OpenTopics.docx
@@ -168,6 +168,18 @@
       </w:pPr>
       <w:r>
         <w:t xml:space="preserve">Double check all seems to be working from trigger event through deleting the images. </w:t>
+      </w:r>
+    </w:p>
+    <w:p>
+      <w:pPr>
+        <w:pStyle w:val="ListParagraph"/>
+        <w:numPr>
+          <w:ilvl w:val="0"/>
+          <w:numId w:val="1"/>
+        </w:numPr>
+      </w:pPr>
+      <w:r>
+        <w:t>Check double calling of Batch file from PLC.</w:t>
       </w:r>
     </w:p>
     <w:p>

</xml_diff>

<commit_message>
Updated TC Version and Packages
</commit_message>
<xml_diff>
--- a/VideoPlaybackSupportFiles/OpenTopics.docx
+++ b/VideoPlaybackSupportFiles/OpenTopics.docx
@@ -18,6 +18,19 @@
       <w:r>
         <w:t>PC start, need to do something to get local scope server to auto start project???</w:t>
       </w:r>
+      <w:r>
+        <w:t>**</w:t>
+      </w:r>
+    </w:p>
+    <w:p>
+      <w:pPr>
+        <w:pStyle w:val="ListParagraph"/>
+      </w:pPr>
+    </w:p>
+    <w:p>
+      <w:r>
+        <w:t>Optional – nice to have</w:t>
+      </w:r>
     </w:p>
     <w:p>
       <w:pPr>
@@ -28,13 +41,91 @@
         </w:numPr>
       </w:pPr>
       <w:r>
-        <w:t>If delete previous scope exports, can scope check the folder and start again with “export 1”</w:t>
-      </w:r>
-    </w:p>
-    <w:p/>
-    <w:p>
-      <w:r>
-        <w:t>Optional – nice to have</w:t>
+        <w:t xml:space="preserve">Need a way to hide batch file. </w:t>
+      </w:r>
+    </w:p>
+    <w:p>
+      <w:pPr>
+        <w:pStyle w:val="ListParagraph"/>
+        <w:rPr>
+          <w:noProof/>
+        </w:rPr>
+      </w:pPr>
+    </w:p>
+    <w:p>
+      <w:pPr>
+        <w:pStyle w:val="ListParagraph"/>
+        <w:rPr>
+          <w:noProof/>
+        </w:rPr>
+      </w:pPr>
+    </w:p>
+    <w:p>
+      <w:pPr>
+        <w:pStyle w:val="ListParagraph"/>
+        <w:rPr>
+          <w:noProof/>
+        </w:rPr>
+      </w:pPr>
+      <w:r>
+        <w:rPr>
+          <w:noProof/>
+        </w:rPr>
+        <w:t>HMI</w:t>
+      </w:r>
+      <w:r>
+        <w:rPr>
+          <w:noProof/>
+        </w:rPr>
+        <w:t xml:space="preserve">  </w:t>
+      </w:r>
+      <w:r>
+        <w:rPr>
+          <w:noProof/>
+          <w:highlight w:val="magenta"/>
+        </w:rPr>
+        <w:t>-- Nathan</w:t>
+      </w:r>
+    </w:p>
+    <w:p>
+      <w:pPr>
+        <w:pStyle w:val="ListParagraph"/>
+        <w:rPr>
+          <w:noProof/>
+        </w:rPr>
+      </w:pPr>
+    </w:p>
+    <w:p>
+      <w:pPr>
+        <w:pStyle w:val="ListParagraph"/>
+        <w:rPr>
+          <w:noProof/>
+        </w:rPr>
+      </w:pPr>
+    </w:p>
+    <w:p>
+      <w:pPr>
+        <w:ind w:left="720"/>
+      </w:pPr>
+      <w:proofErr w:type="gramStart"/>
+      <w:r>
+        <w:t>PLC</w:t>
+      </w:r>
+      <w:r>
+        <w:t xml:space="preserve">  </w:t>
+      </w:r>
+      <w:r>
+        <w:rPr>
+          <w:highlight w:val="green"/>
+        </w:rPr>
+        <w:t>--</w:t>
+      </w:r>
+      <w:proofErr w:type="gramEnd"/>
+      <w:r>
+        <w:rPr>
+          <w:highlight w:val="green"/>
+        </w:rPr>
+        <w:t xml:space="preserve"> Alyssa</w:t>
       </w:r>
     </w:p>
     <w:p>
@@ -46,84 +137,49 @@
         </w:numPr>
       </w:pPr>
       <w:r>
-        <w:t xml:space="preserve">Need a way to hide batch file. </w:t>
-      </w:r>
-    </w:p>
-    <w:p>
-      <w:pPr>
-        <w:pStyle w:val="ListParagraph"/>
-        <w:rPr>
-          <w:noProof/>
-        </w:rPr>
-      </w:pPr>
-    </w:p>
-    <w:p>
-      <w:pPr>
-        <w:pStyle w:val="ListParagraph"/>
-        <w:rPr>
-          <w:noProof/>
-        </w:rPr>
-      </w:pPr>
-    </w:p>
-    <w:p>
-      <w:pPr>
-        <w:pStyle w:val="ListParagraph"/>
-        <w:rPr>
-          <w:noProof/>
-        </w:rPr>
-      </w:pPr>
-      <w:r>
-        <w:rPr>
-          <w:noProof/>
-        </w:rPr>
-        <w:t>HMI</w:t>
-      </w:r>
-      <w:r>
-        <w:rPr>
-          <w:noProof/>
-        </w:rPr>
-        <w:t xml:space="preserve">  </w:t>
-      </w:r>
-      <w:r>
-        <w:rPr>
-          <w:noProof/>
-          <w:highlight w:val="magenta"/>
-        </w:rPr>
-        <w:t>-- Nathan</w:t>
-      </w:r>
-    </w:p>
-    <w:p>
-      <w:pPr>
-        <w:pStyle w:val="ListParagraph"/>
-        <w:rPr>
-          <w:noProof/>
-        </w:rPr>
-      </w:pPr>
-    </w:p>
-    <w:p>
-      <w:pPr>
-        <w:ind w:left="720"/>
-      </w:pPr>
+        <w:t>Update PLC code to new PLC FB block</w:t>
+      </w:r>
+    </w:p>
+    <w:p>
+      <w:pPr>
+        <w:pStyle w:val="ListParagraph"/>
+        <w:numPr>
+          <w:ilvl w:val="0"/>
+          <w:numId w:val="1"/>
+        </w:numPr>
+      </w:pPr>
+      <w:r>
+        <w:t xml:space="preserve">Testing Startup behavior of Scope on </w:t>
+      </w:r>
       <w:proofErr w:type="gramStart"/>
       <w:r>
-        <w:t>PLC</w:t>
-      </w:r>
-      <w:r>
-        <w:t xml:space="preserve">  </w:t>
-      </w:r>
-      <w:r>
-        <w:rPr>
-          <w:highlight w:val="green"/>
-        </w:rPr>
-        <w:t>--</w:t>
+        <w:t xml:space="preserve">TCCE </w:t>
+      </w:r>
+      <w:r>
+        <w:t xml:space="preserve"> *</w:t>
       </w:r>
       <w:proofErr w:type="gramEnd"/>
       <w:r>
-        <w:rPr>
-          <w:highlight w:val="green"/>
-        </w:rPr>
-        <w:t xml:space="preserve"> Alyssa</w:t>
-      </w:r>
+        <w:t>*</w:t>
+      </w:r>
+    </w:p>
+    <w:p>
+      <w:pPr>
+        <w:pStyle w:val="ListParagraph"/>
+        <w:numPr>
+          <w:ilvl w:val="0"/>
+          <w:numId w:val="1"/>
+        </w:numPr>
+      </w:pPr>
+      <w:r>
+        <w:t>Clean up/out vision process</w:t>
+      </w:r>
+    </w:p>
+    <w:p>
+      <w:pPr>
+        <w:pStyle w:val="ListParagraph"/>
+        <w:ind w:left="1440"/>
+      </w:pPr>
     </w:p>
     <w:p>
       <w:pPr>

</xml_diff>

<commit_message>
Updated open topics doc
</commit_message>
<xml_diff>
--- a/VideoPlaybackSupportFiles/OpenTopics.docx
+++ b/VideoPlaybackSupportFiles/OpenTopics.docx
@@ -107,7 +107,6 @@
       <w:pPr>
         <w:ind w:left="720"/>
       </w:pPr>
-      <w:proofErr w:type="gramStart"/>
       <w:r>
         <w:t>PLC</w:t>
       </w:r>
@@ -118,14 +117,7 @@
         <w:rPr>
           <w:highlight w:val="green"/>
         </w:rPr>
-        <w:t>--</w:t>
-      </w:r>
-      <w:proofErr w:type="gramEnd"/>
-      <w:r>
-        <w:rPr>
-          <w:highlight w:val="green"/>
-        </w:rPr>
-        <w:t xml:space="preserve"> Alyssa</w:t>
+        <w:t>-- Alyssa</w:t>
       </w:r>
     </w:p>
     <w:p>
@@ -149,18 +141,10 @@
         </w:numPr>
       </w:pPr>
       <w:r>
-        <w:t xml:space="preserve">Testing Startup behavior of Scope on </w:t>
-      </w:r>
-      <w:proofErr w:type="gramStart"/>
-      <w:r>
-        <w:t xml:space="preserve">TCCE </w:t>
-      </w:r>
-      <w:r>
-        <w:t xml:space="preserve"> *</w:t>
-      </w:r>
-      <w:proofErr w:type="gramEnd"/>
-      <w:r>
-        <w:t>*</w:t>
+        <w:t xml:space="preserve">Testing Startup behavior of Scope on TCCE </w:t>
+      </w:r>
+      <w:r>
+        <w:t xml:space="preserve"> **</w:t>
       </w:r>
     </w:p>
     <w:p>
@@ -211,6 +195,21 @@
       </w:pPr>
       <w:r>
         <w:t xml:space="preserve">Video seems to be only 10-12 seconds long, should be 10 frames per second and about 30 seconds long… </w:t>
+      </w:r>
+    </w:p>
+    <w:p>
+      <w:pPr>
+        <w:pStyle w:val="ListParagraph"/>
+        <w:numPr>
+          <w:ilvl w:val="0"/>
+          <w:numId w:val="1"/>
+        </w:numPr>
+      </w:pPr>
+      <w:r>
+        <w:t>Done</w:t>
+      </w:r>
+      <w:r>
+        <w:t>.</w:t>
       </w:r>
     </w:p>
     <w:p/>

</xml_diff>

<commit_message>
Revert "Updated TC Version and Packages"
This reverts commit 63471d31055a22d76e7b5b176be2f16733c5482b.
</commit_message>
<xml_diff>
--- a/VideoPlaybackSupportFiles/OpenTopics.docx
+++ b/VideoPlaybackSupportFiles/OpenTopics.docx
@@ -18,19 +18,6 @@
       <w:r>
         <w:t>PC start, need to do something to get local scope server to auto start project???</w:t>
       </w:r>
-      <w:r>
-        <w:t>**</w:t>
-      </w:r>
-    </w:p>
-    <w:p>
-      <w:pPr>
-        <w:pStyle w:val="ListParagraph"/>
-      </w:pPr>
-    </w:p>
-    <w:p>
-      <w:r>
-        <w:t>Optional – nice to have</w:t>
-      </w:r>
     </w:p>
     <w:p>
       <w:pPr>
@@ -41,91 +28,13 @@
         </w:numPr>
       </w:pPr>
       <w:r>
-        <w:t xml:space="preserve">Need a way to hide batch file. </w:t>
-      </w:r>
-    </w:p>
-    <w:p>
-      <w:pPr>
-        <w:pStyle w:val="ListParagraph"/>
-        <w:rPr>
-          <w:noProof/>
-        </w:rPr>
-      </w:pPr>
-    </w:p>
-    <w:p>
-      <w:pPr>
-        <w:pStyle w:val="ListParagraph"/>
-        <w:rPr>
-          <w:noProof/>
-        </w:rPr>
-      </w:pPr>
-    </w:p>
-    <w:p>
-      <w:pPr>
-        <w:pStyle w:val="ListParagraph"/>
-        <w:rPr>
-          <w:noProof/>
-        </w:rPr>
-      </w:pPr>
-      <w:r>
-        <w:rPr>
-          <w:noProof/>
-        </w:rPr>
-        <w:t>HMI</w:t>
-      </w:r>
-      <w:r>
-        <w:rPr>
-          <w:noProof/>
-        </w:rPr>
-        <w:t xml:space="preserve">  </w:t>
-      </w:r>
-      <w:r>
-        <w:rPr>
-          <w:noProof/>
-          <w:highlight w:val="magenta"/>
-        </w:rPr>
-        <w:t>-- Nathan</w:t>
-      </w:r>
-    </w:p>
-    <w:p>
-      <w:pPr>
-        <w:pStyle w:val="ListParagraph"/>
-        <w:rPr>
-          <w:noProof/>
-        </w:rPr>
-      </w:pPr>
-    </w:p>
-    <w:p>
-      <w:pPr>
-        <w:pStyle w:val="ListParagraph"/>
-        <w:rPr>
-          <w:noProof/>
-        </w:rPr>
-      </w:pPr>
-    </w:p>
-    <w:p>
-      <w:pPr>
-        <w:ind w:left="720"/>
-      </w:pPr>
-      <w:proofErr w:type="gramStart"/>
-      <w:r>
-        <w:t>PLC</w:t>
-      </w:r>
-      <w:r>
-        <w:t xml:space="preserve">  </w:t>
-      </w:r>
-      <w:r>
-        <w:rPr>
-          <w:highlight w:val="green"/>
-        </w:rPr>
-        <w:t>--</w:t>
-      </w:r>
-      <w:proofErr w:type="gramEnd"/>
-      <w:r>
-        <w:rPr>
-          <w:highlight w:val="green"/>
-        </w:rPr>
-        <w:t xml:space="preserve"> Alyssa</w:t>
+        <w:t>If delete previous scope exports, can scope check the folder and start again with “export 1”</w:t>
+      </w:r>
+    </w:p>
+    <w:p/>
+    <w:p>
+      <w:r>
+        <w:t>Optional – nice to have</w:t>
       </w:r>
     </w:p>
     <w:p>
@@ -137,49 +46,84 @@
         </w:numPr>
       </w:pPr>
       <w:r>
-        <w:t>Update PLC code to new PLC FB block</w:t>
+        <w:t xml:space="preserve">Need a way to hide batch file. </w:t>
       </w:r>
     </w:p>
     <w:p>
       <w:pPr>
         <w:pStyle w:val="ListParagraph"/>
-        <w:numPr>
-          <w:ilvl w:val="0"/>
-          <w:numId w:val="1"/>
-        </w:numPr>
-      </w:pPr>
-      <w:r>
-        <w:t xml:space="preserve">Testing Startup behavior of Scope on </w:t>
-      </w:r>
+        <w:rPr>
+          <w:noProof/>
+        </w:rPr>
+      </w:pPr>
+    </w:p>
+    <w:p>
+      <w:pPr>
+        <w:pStyle w:val="ListParagraph"/>
+        <w:rPr>
+          <w:noProof/>
+        </w:rPr>
+      </w:pPr>
+    </w:p>
+    <w:p>
+      <w:pPr>
+        <w:pStyle w:val="ListParagraph"/>
+        <w:rPr>
+          <w:noProof/>
+        </w:rPr>
+      </w:pPr>
+      <w:r>
+        <w:rPr>
+          <w:noProof/>
+        </w:rPr>
+        <w:t>HMI</w:t>
+      </w:r>
+      <w:r>
+        <w:rPr>
+          <w:noProof/>
+        </w:rPr>
+        <w:t xml:space="preserve">  </w:t>
+      </w:r>
+      <w:r>
+        <w:rPr>
+          <w:noProof/>
+          <w:highlight w:val="magenta"/>
+        </w:rPr>
+        <w:t>-- Nathan</w:t>
+      </w:r>
+    </w:p>
+    <w:p>
+      <w:pPr>
+        <w:pStyle w:val="ListParagraph"/>
+        <w:rPr>
+          <w:noProof/>
+        </w:rPr>
+      </w:pPr>
+    </w:p>
+    <w:p>
+      <w:pPr>
+        <w:ind w:left="720"/>
+      </w:pPr>
       <w:proofErr w:type="gramStart"/>
       <w:r>
-        <w:t xml:space="preserve">TCCE </w:t>
-      </w:r>
-      <w:r>
-        <w:t xml:space="preserve"> *</w:t>
+        <w:t>PLC</w:t>
+      </w:r>
+      <w:r>
+        <w:t xml:space="preserve">  </w:t>
+      </w:r>
+      <w:r>
+        <w:rPr>
+          <w:highlight w:val="green"/>
+        </w:rPr>
+        <w:t>--</w:t>
       </w:r>
       <w:proofErr w:type="gramEnd"/>
       <w:r>
-        <w:t>*</w:t>
-      </w:r>
-    </w:p>
-    <w:p>
-      <w:pPr>
-        <w:pStyle w:val="ListParagraph"/>
-        <w:numPr>
-          <w:ilvl w:val="0"/>
-          <w:numId w:val="1"/>
-        </w:numPr>
-      </w:pPr>
-      <w:r>
-        <w:t>Clean up/out vision process</w:t>
-      </w:r>
-    </w:p>
-    <w:p>
-      <w:pPr>
-        <w:pStyle w:val="ListParagraph"/>
-        <w:ind w:left="1440"/>
-      </w:pPr>
+        <w:rPr>
+          <w:highlight w:val="green"/>
+        </w:rPr>
+        <w:t xml:space="preserve"> Alyssa</w:t>
+      </w:r>
     </w:p>
     <w:p>
       <w:pPr>

</xml_diff>

<commit_message>
Packaged code for listening to alarm and calling FB a bit tighter
</commit_message>
<xml_diff>
--- a/VideoPlaybackSupportFiles/OpenTopics.docx
+++ b/VideoPlaybackSupportFiles/OpenTopics.docx
@@ -1,6 +1,6 @@
 
 <file path=word/document.xml><?xml version="1.0" encoding="utf-8"?>
-<w:document xmlns:wpc="http://schemas.microsoft.com/office/word/2010/wordprocessingCanvas" xmlns:cx="http://schemas.microsoft.com/office/drawing/2014/chartex" xmlns:cx1="http://schemas.microsoft.com/office/drawing/2015/9/8/chartex" xmlns:cx2="http://schemas.microsoft.com/office/drawing/2015/10/21/chartex" xmlns:cx3="http://schemas.microsoft.com/office/drawing/2016/5/9/chartex" xmlns:cx4="http://schemas.microsoft.com/office/drawing/2016/5/10/chartex" xmlns:cx5="http://schemas.microsoft.com/office/drawing/2016/5/11/chartex" xmlns:cx6="http://schemas.microsoft.com/office/drawing/2016/5/12/chartex" xmlns:cx7="http://schemas.microsoft.com/office/drawing/2016/5/13/chartex" xmlns:cx8="http://schemas.microsoft.com/office/drawing/2016/5/14/chartex" xmlns:mc="http://schemas.openxmlformats.org/markup-compatibility/2006" xmlns:aink="http://schemas.microsoft.com/office/drawing/2016/ink" xmlns:am3d="http://schemas.microsoft.com/office/drawing/2017/model3d" xmlns:o="urn:schemas-microsoft-com:office:office" xmlns:r="http://schemas.openxmlformats.org/officeDocument/2006/relationships" xmlns:m="http://schemas.openxmlformats.org/officeDocument/2006/math" xmlns:v="urn:schemas-microsoft-com:vml" xmlns:wp14="http://schemas.microsoft.com/office/word/2010/wordprocessingDrawing" xmlns:wp="http://schemas.openxmlformats.org/drawingml/2006/wordprocessingDrawing" xmlns:w10="urn:schemas-microsoft-com:office:word" xmlns:w="http://schemas.openxmlformats.org/wordprocessingml/2006/main" xmlns:w14="http://schemas.microsoft.com/office/word/2010/wordml" xmlns:w15="http://schemas.microsoft.com/office/word/2012/wordml" xmlns:w16cex="http://schemas.microsoft.com/office/word/2018/wordml/cex" xmlns:w16cid="http://schemas.microsoft.com/office/word/2016/wordml/cid" xmlns:w16="http://schemas.microsoft.com/office/word/2018/wordml" xmlns:w16sdtdh="http://schemas.microsoft.com/office/word/2020/wordml/sdtdatahash" xmlns:w16se="http://schemas.microsoft.com/office/word/2015/wordml/symex" xmlns:wpg="http://schemas.microsoft.com/office/word/2010/wordprocessingGroup" xmlns:wpi="http://schemas.microsoft.com/office/word/2010/wordprocessingInk" xmlns:wne="http://schemas.microsoft.com/office/word/2006/wordml" xmlns:wps="http://schemas.microsoft.com/office/word/2010/wordprocessingShape" mc:Ignorable="w14 w15 w16se w16cid w16 w16cex w16sdtdh wp14">
+<w:document xmlns:wpc="http://schemas.microsoft.com/office/word/2010/wordprocessingCanvas" xmlns:cx="http://schemas.microsoft.com/office/drawing/2014/chartex" xmlns:cx1="http://schemas.microsoft.com/office/drawing/2015/9/8/chartex" xmlns:cx2="http://schemas.microsoft.com/office/drawing/2015/10/21/chartex" xmlns:cx3="http://schemas.microsoft.com/office/drawing/2016/5/9/chartex" xmlns:cx4="http://schemas.microsoft.com/office/drawing/2016/5/10/chartex" xmlns:cx5="http://schemas.microsoft.com/office/drawing/2016/5/11/chartex" xmlns:cx6="http://schemas.microsoft.com/office/drawing/2016/5/12/chartex" xmlns:cx7="http://schemas.microsoft.com/office/drawing/2016/5/13/chartex" xmlns:cx8="http://schemas.microsoft.com/office/drawing/2016/5/14/chartex" xmlns:mc="http://schemas.openxmlformats.org/markup-compatibility/2006" xmlns:aink="http://schemas.microsoft.com/office/drawing/2016/ink" xmlns:am3d="http://schemas.microsoft.com/office/drawing/2017/model3d" xmlns:o="urn:schemas-microsoft-com:office:office" xmlns:oel="http://schemas.microsoft.com/office/2019/extlst" xmlns:r="http://schemas.openxmlformats.org/officeDocument/2006/relationships" xmlns:m="http://schemas.openxmlformats.org/officeDocument/2006/math" xmlns:v="urn:schemas-microsoft-com:vml" xmlns:wp14="http://schemas.microsoft.com/office/word/2010/wordprocessingDrawing" xmlns:wp="http://schemas.openxmlformats.org/drawingml/2006/wordprocessingDrawing" xmlns:w10="urn:schemas-microsoft-com:office:word" xmlns:w="http://schemas.openxmlformats.org/wordprocessingml/2006/main" xmlns:w14="http://schemas.microsoft.com/office/word/2010/wordml" xmlns:w15="http://schemas.microsoft.com/office/word/2012/wordml" xmlns:w16cex="http://schemas.microsoft.com/office/word/2018/wordml/cex" xmlns:w16cid="http://schemas.microsoft.com/office/word/2016/wordml/cid" xmlns:w16="http://schemas.microsoft.com/office/word/2018/wordml" xmlns:w16sdtdh="http://schemas.microsoft.com/office/word/2020/wordml/sdtdatahash" xmlns:w16se="http://schemas.microsoft.com/office/word/2015/wordml/symex" xmlns:wpg="http://schemas.microsoft.com/office/word/2010/wordprocessingGroup" xmlns:wpi="http://schemas.microsoft.com/office/word/2010/wordprocessingInk" xmlns:wne="http://schemas.microsoft.com/office/word/2006/wordml" xmlns:wps="http://schemas.microsoft.com/office/word/2010/wordprocessingShape" mc:Ignorable="w14 w15 w16se w16cid w16 w16cex w16sdtdh wp14">
   <w:body>
     <w:p>
       <w:r>
@@ -18,20 +18,15 @@
       <w:r>
         <w:t>PC start, need to do something to get local scope server to auto start project???</w:t>
       </w:r>
+      <w:r>
+        <w:t xml:space="preserve"> On some PCs this does not seem to work each time.</w:t>
+      </w:r>
     </w:p>
     <w:p>
       <w:pPr>
         <w:pStyle w:val="ListParagraph"/>
-        <w:numPr>
-          <w:ilvl w:val="0"/>
-          <w:numId w:val="1"/>
-        </w:numPr>
-      </w:pPr>
-      <w:r>
-        <w:t>If delete previous scope exports, can scope check the folder and start again with “export 1”</w:t>
-      </w:r>
+      </w:pPr>
     </w:p>
-    <w:p/>
     <w:p>
       <w:r>
         <w:t>Optional – nice to have</w:t>
@@ -65,144 +60,8 @@
         </w:rPr>
       </w:pPr>
     </w:p>
-    <w:p>
-      <w:pPr>
-        <w:pStyle w:val="ListParagraph"/>
-        <w:rPr>
-          <w:noProof/>
-        </w:rPr>
-      </w:pPr>
-      <w:r>
-        <w:rPr>
-          <w:noProof/>
-        </w:rPr>
-        <w:t>HMI</w:t>
-      </w:r>
-      <w:r>
-        <w:rPr>
-          <w:noProof/>
-        </w:rPr>
-        <w:t xml:space="preserve">  </w:t>
-      </w:r>
-      <w:r>
-        <w:rPr>
-          <w:noProof/>
-          <w:highlight w:val="magenta"/>
-        </w:rPr>
-        <w:t>-- Nathan</w:t>
-      </w:r>
-    </w:p>
-    <w:p>
-      <w:pPr>
-        <w:pStyle w:val="ListParagraph"/>
-        <w:rPr>
-          <w:noProof/>
-        </w:rPr>
-      </w:pPr>
-    </w:p>
-    <w:p>
-      <w:pPr>
-        <w:ind w:left="720"/>
-      </w:pPr>
-      <w:proofErr w:type="gramStart"/>
-      <w:r>
-        <w:t>PLC</w:t>
-      </w:r>
-      <w:r>
-        <w:t xml:space="preserve">  </w:t>
-      </w:r>
-      <w:r>
-        <w:rPr>
-          <w:highlight w:val="green"/>
-        </w:rPr>
-        <w:t>--</w:t>
-      </w:r>
-      <w:proofErr w:type="gramEnd"/>
-      <w:r>
-        <w:rPr>
-          <w:highlight w:val="green"/>
-        </w:rPr>
-        <w:t xml:space="preserve"> Alyssa</w:t>
-      </w:r>
-    </w:p>
-    <w:p>
-      <w:pPr>
-        <w:pStyle w:val="ListParagraph"/>
-        <w:ind w:left="1440"/>
-      </w:pPr>
-    </w:p>
-    <w:p>
-      <w:r>
-        <w:t>Video Playback</w:t>
-      </w:r>
-      <w:r>
-        <w:t xml:space="preserve"> </w:t>
-      </w:r>
-      <w:r>
-        <w:rPr>
-          <w:highlight w:val="green"/>
-        </w:rPr>
-        <w:t>--Alyssa</w:t>
-      </w:r>
-    </w:p>
-    <w:p>
-      <w:pPr>
-        <w:pStyle w:val="ListParagraph"/>
-        <w:numPr>
-          <w:ilvl w:val="0"/>
-          <w:numId w:val="1"/>
-        </w:numPr>
-      </w:pPr>
-      <w:r>
-        <w:t xml:space="preserve">Video seems to be only 10-12 seconds long, should be 10 frames per second and about 30 seconds long… </w:t>
-      </w:r>
-    </w:p>
     <w:p/>
     <w:p/>
-    <w:p>
-      <w:r>
-        <w:rPr>
-          <w:highlight w:val="cyan"/>
-        </w:rPr>
-        <w:t>** ALL</w:t>
-      </w:r>
-      <w:r>
-        <w:t xml:space="preserve"> </w:t>
-      </w:r>
-    </w:p>
-    <w:p>
-      <w:pPr>
-        <w:pStyle w:val="ListParagraph"/>
-        <w:numPr>
-          <w:ilvl w:val="0"/>
-          <w:numId w:val="1"/>
-        </w:numPr>
-      </w:pPr>
-      <w:r>
-        <w:t xml:space="preserve">Need to document setup, file paths, etc. </w:t>
-      </w:r>
-      <w:r>
-        <w:t xml:space="preserve"> --- If you want to add, GO FOR IT </w:t>
-      </w:r>
-      <w:r>
-        <w:rPr>
-          <mc:AlternateContent>
-            <mc:Choice Requires="w16se"/>
-            <mc:Fallback>
-              <w:rFonts w:ascii="Segoe UI Emoji" w:eastAsia="Segoe UI Emoji" w:hAnsi="Segoe UI Emoji" w:cs="Segoe UI Emoji"/>
-            </mc:Fallback>
-          </mc:AlternateContent>
-        </w:rPr>
-        <mc:AlternateContent>
-          <mc:Choice Requires="w16se">
-            <w16se:symEx w16se:font="Segoe UI Emoji" w16se:char="1F60A"/>
-          </mc:Choice>
-          <mc:Fallback>
-            <w:t>😊</w:t>
-          </mc:Fallback>
-        </mc:AlternateContent>
-      </w:r>
-    </w:p>
     <w:sectPr>
       <w:pgSz w:w="12240" w:h="15840"/>
       <w:pgMar w:top="1440" w:right="1440" w:bottom="1440" w:left="1440" w:header="720" w:footer="720" w:gutter="0"/>
@@ -214,7 +73,7 @@
 </file>
 
 <file path=word/numbering.xml><?xml version="1.0" encoding="utf-8"?>
-<w:numbering xmlns:wpc="http://schemas.microsoft.com/office/word/2010/wordprocessingCanvas" xmlns:cx="http://schemas.microsoft.com/office/drawing/2014/chartex" xmlns:cx1="http://schemas.microsoft.com/office/drawing/2015/9/8/chartex" xmlns:cx2="http://schemas.microsoft.com/office/drawing/2015/10/21/chartex" xmlns:cx3="http://schemas.microsoft.com/office/drawing/2016/5/9/chartex" xmlns:cx4="http://schemas.microsoft.com/office/drawing/2016/5/10/chartex" xmlns:cx5="http://schemas.microsoft.com/office/drawing/2016/5/11/chartex" xmlns:cx6="http://schemas.microsoft.com/office/drawing/2016/5/12/chartex" xmlns:cx7="http://schemas.microsoft.com/office/drawing/2016/5/13/chartex" xmlns:cx8="http://schemas.microsoft.com/office/drawing/2016/5/14/chartex" xmlns:mc="http://schemas.openxmlformats.org/markup-compatibility/2006" xmlns:aink="http://schemas.microsoft.com/office/drawing/2016/ink" xmlns:am3d="http://schemas.microsoft.com/office/drawing/2017/model3d" xmlns:o="urn:schemas-microsoft-com:office:office" xmlns:r="http://schemas.openxmlformats.org/officeDocument/2006/relationships" xmlns:m="http://schemas.openxmlformats.org/officeDocument/2006/math" xmlns:v="urn:schemas-microsoft-com:vml" xmlns:wp14="http://schemas.microsoft.com/office/word/2010/wordprocessingDrawing" xmlns:wp="http://schemas.openxmlformats.org/drawingml/2006/wordprocessingDrawing" xmlns:w10="urn:schemas-microsoft-com:office:word" xmlns:w="http://schemas.openxmlformats.org/wordprocessingml/2006/main" xmlns:w14="http://schemas.microsoft.com/office/word/2010/wordml" xmlns:w15="http://schemas.microsoft.com/office/word/2012/wordml" xmlns:w16cex="http://schemas.microsoft.com/office/word/2018/wordml/cex" xmlns:w16cid="http://schemas.microsoft.com/office/word/2016/wordml/cid" xmlns:w16="http://schemas.microsoft.com/office/word/2018/wordml" xmlns:w16sdtdh="http://schemas.microsoft.com/office/word/2020/wordml/sdtdatahash" xmlns:w16se="http://schemas.microsoft.com/office/word/2015/wordml/symex" xmlns:wpg="http://schemas.microsoft.com/office/word/2010/wordprocessingGroup" xmlns:wpi="http://schemas.microsoft.com/office/word/2010/wordprocessingInk" xmlns:wne="http://schemas.microsoft.com/office/word/2006/wordml" xmlns:wps="http://schemas.microsoft.com/office/word/2010/wordprocessingShape" mc:Ignorable="w14 w15 w16se w16cid w16 w16cex w16sdtdh wp14">
+<w:numbering xmlns:wpc="http://schemas.microsoft.com/office/word/2010/wordprocessingCanvas" xmlns:cx="http://schemas.microsoft.com/office/drawing/2014/chartex" xmlns:cx1="http://schemas.microsoft.com/office/drawing/2015/9/8/chartex" xmlns:cx2="http://schemas.microsoft.com/office/drawing/2015/10/21/chartex" xmlns:cx3="http://schemas.microsoft.com/office/drawing/2016/5/9/chartex" xmlns:cx4="http://schemas.microsoft.com/office/drawing/2016/5/10/chartex" xmlns:cx5="http://schemas.microsoft.com/office/drawing/2016/5/11/chartex" xmlns:cx6="http://schemas.microsoft.com/office/drawing/2016/5/12/chartex" xmlns:cx7="http://schemas.microsoft.com/office/drawing/2016/5/13/chartex" xmlns:cx8="http://schemas.microsoft.com/office/drawing/2016/5/14/chartex" xmlns:mc="http://schemas.openxmlformats.org/markup-compatibility/2006" xmlns:aink="http://schemas.microsoft.com/office/drawing/2016/ink" xmlns:am3d="http://schemas.microsoft.com/office/drawing/2017/model3d" xmlns:o="urn:schemas-microsoft-com:office:office" xmlns:oel="http://schemas.microsoft.com/office/2019/extlst" xmlns:r="http://schemas.openxmlformats.org/officeDocument/2006/relationships" xmlns:m="http://schemas.openxmlformats.org/officeDocument/2006/math" xmlns:v="urn:schemas-microsoft-com:vml" xmlns:wp14="http://schemas.microsoft.com/office/word/2010/wordprocessingDrawing" xmlns:wp="http://schemas.openxmlformats.org/drawingml/2006/wordprocessingDrawing" xmlns:w10="urn:schemas-microsoft-com:office:word" xmlns:w="http://schemas.openxmlformats.org/wordprocessingml/2006/main" xmlns:w14="http://schemas.microsoft.com/office/word/2010/wordml" xmlns:w15="http://schemas.microsoft.com/office/word/2012/wordml" xmlns:w16cex="http://schemas.microsoft.com/office/word/2018/wordml/cex" xmlns:w16cid="http://schemas.microsoft.com/office/word/2016/wordml/cid" xmlns:w16="http://schemas.microsoft.com/office/word/2018/wordml" xmlns:w16sdtdh="http://schemas.microsoft.com/office/word/2020/wordml/sdtdatahash" xmlns:w16se="http://schemas.microsoft.com/office/word/2015/wordml/symex" xmlns:wpg="http://schemas.microsoft.com/office/word/2010/wordprocessingGroup" xmlns:wpi="http://schemas.microsoft.com/office/word/2010/wordprocessingInk" xmlns:wne="http://schemas.microsoft.com/office/word/2006/wordml" xmlns:wps="http://schemas.microsoft.com/office/word/2010/wordprocessingShape" mc:Ignorable="w14 w15 w16se w16cid w16 w16cex w16sdtdh wp14">
   <w:abstractNum w:abstractNumId="0" w15:restartNumberingAfterBreak="0">
     <w:nsid w:val="571F7729"/>
     <w:multiLevelType w:val="hybridMultilevel"/>
@@ -327,7 +186,7 @@
       </w:rPr>
     </w:lvl>
   </w:abstractNum>
-  <w:num w:numId="1">
+  <w:num w:numId="1" w16cid:durableId="1940021838">
     <w:abstractNumId w:val="0"/>
   </w:num>
 </w:numbering>

</xml_diff>

<commit_message>
Updated batch file to delete output images folder after it makes a video. Updated image export path to match Scope Project. Other Minor changes
</commit_message>
<xml_diff>
--- a/VideoPlaybackSupportFiles/OpenTopics.docx
+++ b/VideoPlaybackSupportFiles/OpenTopics.docx
@@ -20,6 +20,30 @@
       </w:r>
       <w:r>
         <w:t xml:space="preserve"> On some PCs this does not seem to work each time.</w:t>
+      </w:r>
+    </w:p>
+    <w:p>
+      <w:pPr>
+        <w:pStyle w:val="ListParagraph"/>
+        <w:numPr>
+          <w:ilvl w:val="0"/>
+          <w:numId w:val="1"/>
+        </w:numPr>
+      </w:pPr>
+      <w:r>
+        <w:t>Video is too fast… maybe it’s the number of images being output? Or settings in the images to file?</w:t>
+      </w:r>
+    </w:p>
+    <w:p>
+      <w:pPr>
+        <w:pStyle w:val="ListParagraph"/>
+        <w:numPr>
+          <w:ilvl w:val="0"/>
+          <w:numId w:val="1"/>
+        </w:numPr>
+      </w:pPr>
+      <w:r>
+        <w:t xml:space="preserve">CPU load on Scope server and Vision process might be an issue… need to test with real camera, and with different camera update rates. </w:t>
       </w:r>
     </w:p>
     <w:p>

</xml_diff>